<commit_message>
Calcular métricas de evaluación del modelo
</commit_message>
<xml_diff>
--- a/Semana8.docx
+++ b/Semana8.docx
@@ -103,6 +103,8 @@
       <w:r>
         <w:t>eas de mejora en el modelo.</w:t>
       </w:r>
+      <w:bookmarkStart w:id="0" w:name="_GoBack"/>
+      <w:bookmarkEnd w:id="0"/>
     </w:p>
     <w:p/>
     <w:p>
@@ -111,7 +113,6 @@
           <w:b/>
         </w:rPr>
       </w:pPr>
-      <w:bookmarkStart w:id="0" w:name="_GoBack"/>
       <w:r>
         <w:rPr>
           <w:b/>
@@ -125,7 +126,6 @@
         <w:t>enerar matriz de confusión del modelo CNN</w:t>
       </w:r>
     </w:p>
-    <w:bookmarkEnd w:id="0"/>
     <w:p>
       <w:r>
         <w:t>Se implementó la generación de una matriz de confusión para comparar las clasificaciones realizadas por el modelo CNN con las etiquetas reales de las radiografías de prueba. Esta herramienta permitirá identificar los casos clasificados correctamente y los errores cometidos entre las categorías NORMAL y PNEUMONIA. Los resultados servirán como apoyo para interpretar el desempeño del modelo y orien</w:t>

</xml_diff>

<commit_message>
Generar matriz de confusión del modelo CNN
</commit_message>
<xml_diff>
--- a/Semana8.docx
+++ b/Semana8.docx
@@ -103,8 +103,6 @@
       <w:r>
         <w:t>eas de mejora en el modelo.</w:t>
       </w:r>
-      <w:bookmarkStart w:id="0" w:name="_GoBack"/>
-      <w:bookmarkEnd w:id="0"/>
     </w:p>
     <w:p/>
     <w:p>
@@ -133,6 +131,8 @@
       <w:r>
         <w:t>tar futuras mejoras del sistema.</w:t>
       </w:r>
+      <w:bookmarkStart w:id="0" w:name="_GoBack"/>
+      <w:bookmarkEnd w:id="0"/>
     </w:p>
     <w:sectPr>
       <w:pgSz w:w="12240" w:h="15840"/>

</xml_diff>